<commit_message>
Lab 5: Computer Vision Lab 5 updated
</commit_message>
<xml_diff>
--- a/Lab 5/Lab 5 output.docx
+++ b/Lab 5/Lab 5 output.docx
@@ -4,6 +4,9 @@
   <w:body>
     <w:p>
       <w:r>
+        <w:rPr>
+          <w:noProof/>
+        </w:rPr>
         <w:drawing>
           <wp:inline distT="0" distB="0" distL="0" distR="0" wp14:anchorId="082DB7F9" wp14:editId="73AAD87F">
             <wp:extent cx="5731510" cy="1117600"/>
@@ -43,6 +46,9 @@
     </w:p>
     <w:p>
       <w:r>
+        <w:rPr>
+          <w:noProof/>
+        </w:rPr>
         <w:drawing>
           <wp:inline distT="0" distB="0" distL="0" distR="0" wp14:anchorId="308C494C" wp14:editId="52E5CDB9">
             <wp:extent cx="5731510" cy="1117600"/>
@@ -82,6 +88,9 @@
     </w:p>
     <w:p>
       <w:r>
+        <w:rPr>
+          <w:noProof/>
+        </w:rPr>
         <w:drawing>
           <wp:inline distT="0" distB="0" distL="0" distR="0" wp14:anchorId="7C97BDEF" wp14:editId="7034947C">
             <wp:extent cx="5731510" cy="1117600"/>
@@ -119,9 +128,48 @@
         </w:drawing>
       </w:r>
     </w:p>
+    <w:p>
+      <w:r>
+        <w:drawing>
+          <wp:inline distT="0" distB="0" distL="0" distR="0" wp14:anchorId="0E03DF1F" wp14:editId="418B3705">
+            <wp:extent cx="5731510" cy="2120900"/>
+            <wp:effectExtent l="0" t="0" r="2540" b="0"/>
+            <wp:docPr id="1353720259" name="Picture 1"/>
+            <wp:cNvGraphicFramePr>
+              <a:graphicFrameLocks xmlns:a="http://schemas.openxmlformats.org/drawingml/2006/main" noChangeAspect="1"/>
+            </wp:cNvGraphicFramePr>
+            <a:graphic xmlns:a="http://schemas.openxmlformats.org/drawingml/2006/main">
+              <a:graphicData uri="http://schemas.openxmlformats.org/drawingml/2006/picture">
+                <pic:pic xmlns:pic="http://schemas.openxmlformats.org/drawingml/2006/picture">
+                  <pic:nvPicPr>
+                    <pic:cNvPr id="1353720259" name=""/>
+                    <pic:cNvPicPr/>
+                  </pic:nvPicPr>
+                  <pic:blipFill>
+                    <a:blip r:embed="rId7"/>
+                    <a:stretch>
+                      <a:fillRect/>
+                    </a:stretch>
+                  </pic:blipFill>
+                  <pic:spPr>
+                    <a:xfrm>
+                      <a:off x="0" y="0"/>
+                      <a:ext cx="5731510" cy="2120900"/>
+                    </a:xfrm>
+                    <a:prstGeom prst="rect">
+                      <a:avLst/>
+                    </a:prstGeom>
+                  </pic:spPr>
+                </pic:pic>
+              </a:graphicData>
+            </a:graphic>
+          </wp:inline>
+        </w:drawing>
+      </w:r>
+    </w:p>
     <w:sectPr>
       <w:pgSz w:w="11906" w:h="16838"/>
-      <w:pgMar w:top="1440" w:right="1440" w:bottom="1440" w:left="1440" w:header="708" w:footer="708" w:gutter="0"/>
+      <w:pgMar w:top="720" w:right="720" w:bottom="720" w:left="720" w:header="708" w:footer="708" w:gutter="0"/>
       <w:cols w:space="708"/>
       <w:docGrid w:linePitch="360"/>
     </w:sectPr>

</xml_diff>